<commit_message>
Fix wording errors in Offer Letter template
Found while auditing all six templates for the same class of issue as
the Internship Joining Letter fix: three plain wording bugs in the
Offer Letter's body text, unrelated to placeholders —

- "Base on earlier discussions" -> "Based on earlier discussions"
- "The offer would letter also stand automatically withdrawn..." ->
  "This offer letter would also stand automatically withdrawn..."
  (garbled subject, and made consistent with the sentence right above
  it: "This offer letter stands automatically withdrawn...")
- "Break up is given at below." -> "Break up is given below."

The other four templates (Appointment Letter, Experience Letter,
Increment Letter, Internship Experience Letter) were checked the same
way and have no duplicate or colliding placeholders and no wording
issues.

Co-Authored-By: Claude Sonnet 5 <noreply@anthropic.com>
Claude-Session: https://claude.ai/code/session_01MEHPF7p4Mvi3Bv2am4sPQK
</commit_message>
<xml_diff>
--- a/hr-ai-interviewer/backend/src/templates/offer-letter.docx
+++ b/hr-ai-interviewer/backend/src/templates/offer-letter.docx
@@ -650,7 +650,7 @@
           <w:sz w:val="22"/>
           <w:szCs w:val="22"/>
         </w:rPr>
-        <w:t xml:space="preserve">Base on earlier discussions, it is our pleasure to extend the following letter of employment to you with </w:t>
+        <w:t xml:space="preserve">Based on earlier discussions, it is our pleasure to extend the following letter of employment to you with </w:t>
       </w:r>
       <w:r>
         <w:rPr>
@@ -858,7 +858,7 @@
                 <w:color w:val="808080"/>
                 <w:szCs w:val="22"/>
               </w:rPr>
-              <w:t>[Annual CTC] -Break up is given at below.</w:t>
+              <w:t>[Annual CTC] - Break up is given below.</w:t>
             </w:r>
           </w:p>
         </w:tc>
@@ -1842,7 +1842,7 @@
           <w:color w:val="2C2C2C"/>
           <w:sz w:val="21"/>
         </w:rPr>
-        <w:t>The offer would letter also stand automatically withdrawn if you are unable to join the position on the aforementioned date of joining post your acceptance of the offer letter.</w:t>
+        <w:t>This offer letter would also stand automatically withdrawn if you are unable to join the position on the aforementioned date of joining post your acceptance of the offer letter.</w:t>
       </w:r>
     </w:p>
     <w:p>

</xml_diff>

<commit_message>
Match Offer Letter's document checklist items 3-6 formatting to 1 & 2
Items 1 "Education & Training Certificates" and 2 "All Previous
Employer Certificates:" were bold navy (#002060); items 3-6 (PAN Card,
Aadhar Card, proof of residence, photographs) used the same
ListNumber list style but with no bold/color override, so they read
as visually inconsistent with the two section headers right above
them. Added the same <w:b/><w:bCs/><w:color w:val="002060"/> to both
the paragraph mark and the run for all four items.

Co-Authored-By: Claude Sonnet 5 <noreply@anthropic.com>
Claude-Session: https://claude.ai/code/session_01MEHPF7p4Mvi3Bv2am4sPQK
</commit_message>
<xml_diff>
--- a/hr-ai-interviewer/backend/src/templates/offer-letter.docx
+++ b/hr-ai-interviewer/backend/src/templates/offer-letter.docx
@@ -1493,11 +1493,17 @@
         <w:spacing w:line="276" w:lineRule="auto"/>
         <w:rPr>
           <w:rFonts w:eastAsia="Arial"/>
+          <w:b/>
+          <w:bCs/>
+          <w:color w:val="002060"/>
         </w:rPr>
       </w:pPr>
       <w:r>
         <w:rPr>
           <w:rFonts w:eastAsia="Arial"/>
+          <w:b/>
+          <w:bCs/>
+          <w:color w:val="002060"/>
         </w:rPr>
         <w:t>Copy of PAN Card (2 Copies).</w:t>
       </w:r>
@@ -1508,11 +1514,17 @@
         <w:spacing w:line="276" w:lineRule="auto"/>
         <w:rPr>
           <w:rFonts w:eastAsia="Arial"/>
+          <w:b/>
+          <w:bCs/>
+          <w:color w:val="002060"/>
         </w:rPr>
       </w:pPr>
       <w:r>
         <w:rPr>
           <w:rFonts w:eastAsia="Arial"/>
+          <w:b/>
+          <w:bCs/>
+          <w:color w:val="002060"/>
         </w:rPr>
         <w:t>Copy of Aadhar Card (2 Copies).</w:t>
       </w:r>
@@ -1523,11 +1535,17 @@
         <w:spacing w:line="276" w:lineRule="auto"/>
         <w:rPr>
           <w:rFonts w:eastAsia="Arial"/>
+          <w:b/>
+          <w:bCs/>
+          <w:color w:val="002060"/>
         </w:rPr>
       </w:pPr>
       <w:r>
         <w:rPr>
           <w:rFonts w:eastAsia="Arial"/>
+          <w:b/>
+          <w:bCs/>
+          <w:color w:val="002060"/>
         </w:rPr>
         <w:t>Proof of Current Residence and Permanent Residence.</w:t>
       </w:r>
@@ -1538,11 +1556,17 @@
         <w:spacing w:line="276" w:lineRule="auto"/>
         <w:rPr>
           <w:rFonts w:eastAsia="Arial"/>
+          <w:b/>
+          <w:bCs/>
+          <w:color w:val="002060"/>
         </w:rPr>
       </w:pPr>
       <w:r>
         <w:rPr>
           <w:rFonts w:eastAsia="Arial"/>
+          <w:b/>
+          <w:bCs/>
+          <w:color w:val="002060"/>
         </w:rPr>
         <w:t>3 Passport size Photographs.</w:t>
       </w:r>

</xml_diff>

<commit_message>
Make the Offer Letter's fixed 0 and dash salary cells fillable
Conveyance, Special Allowances, Medical Allowance, Bonus, the ESIC rows and
both LWF rows were typed straight into the .docx, so HR could never put a real
figure there. They're [placeholders] now (monthly + annual each); a blank one
still prints 0 or a dash, so unchanged letters look exactly as before, and the
form shows that default as a hint.

Co-Authored-By: Claude Sonnet 5.5 <noreply@anthropic.com>
Claude-Session: https://claude.ai/code/session_01MEHPF7p4Mvi3Bv2am4sPQK
</commit_message>
<xml_diff>
--- a/hr-ai-interviewer/backend/src/templates/offer-letter.docx
+++ b/hr-ai-interviewer/backend/src/templates/offer-letter.docx
@@ -2766,7 +2766,7 @@
                 <w:color w:val="767171" w:themeColor="background2" w:themeShade="80"/>
                 <w:sz w:val="18"/>
               </w:rPr>
-              <w:t>0</w:t>
+              <w:t>[Conveyance - Monthly]</w:t>
             </w:r>
           </w:p>
         </w:tc>
@@ -2790,7 +2790,7 @@
                 <w:color w:val="767171" w:themeColor="background2" w:themeShade="80"/>
                 <w:sz w:val="18"/>
               </w:rPr>
-              <w:t>0</w:t>
+              <w:t>[Conveyance - Annual]</w:t>
             </w:r>
           </w:p>
         </w:tc>
@@ -2844,7 +2844,7 @@
                 <w:color w:val="767171" w:themeColor="background2" w:themeShade="80"/>
                 <w:sz w:val="18"/>
               </w:rPr>
-              <w:t>0</w:t>
+              <w:t>[Special Allowances - Monthly]</w:t>
             </w:r>
           </w:p>
         </w:tc>
@@ -2868,7 +2868,7 @@
                 <w:color w:val="767171" w:themeColor="background2" w:themeShade="80"/>
                 <w:sz w:val="18"/>
               </w:rPr>
-              <w:t>0</w:t>
+              <w:t>[Special Allowances - Annual]</w:t>
             </w:r>
           </w:p>
         </w:tc>
@@ -2922,7 +2922,7 @@
                 <w:color w:val="767171" w:themeColor="background2" w:themeShade="80"/>
                 <w:sz w:val="18"/>
               </w:rPr>
-              <w:t>0</w:t>
+              <w:t>[Medical Allowance - Monthly]</w:t>
             </w:r>
           </w:p>
         </w:tc>
@@ -2946,7 +2946,7 @@
                 <w:color w:val="767171" w:themeColor="background2" w:themeShade="80"/>
                 <w:sz w:val="18"/>
               </w:rPr>
-              <w:t>0</w:t>
+              <w:t>[Medical Allowance - Annual]</w:t>
             </w:r>
           </w:p>
         </w:tc>
@@ -3000,7 +3000,7 @@
                 <w:color w:val="767171" w:themeColor="background2" w:themeShade="80"/>
                 <w:sz w:val="18"/>
               </w:rPr>
-              <w:t>0</w:t>
+              <w:t>[Bonus - Monthly]</w:t>
             </w:r>
           </w:p>
         </w:tc>
@@ -3024,7 +3024,7 @@
                 <w:color w:val="767171" w:themeColor="background2" w:themeShade="80"/>
                 <w:sz w:val="18"/>
               </w:rPr>
-              <w:t>0</w:t>
+              <w:t>[Bonus - Annual]</w:t>
             </w:r>
           </w:p>
         </w:tc>
@@ -3241,7 +3241,7 @@
                 <w:color w:val="767171" w:themeColor="background2" w:themeShade="80"/>
                 <w:sz w:val="18"/>
               </w:rPr>
-              <w:t>_</w:t>
+              <w:t>[Employee ESIC - Monthly]</w:t>
             </w:r>
           </w:p>
         </w:tc>
@@ -3265,7 +3265,7 @@
                 <w:color w:val="767171" w:themeColor="background2" w:themeShade="80"/>
                 <w:sz w:val="18"/>
               </w:rPr>
-              <w:t>_</w:t>
+              <w:t>[Employee ESIC - Annual]</w:t>
             </w:r>
           </w:p>
         </w:tc>
@@ -3319,7 +3319,7 @@
                 <w:color w:val="767171" w:themeColor="background2" w:themeShade="80"/>
                 <w:sz w:val="18"/>
               </w:rPr>
-              <w:t>0</w:t>
+              <w:t>[Employee LWF - Monthly]</w:t>
             </w:r>
           </w:p>
         </w:tc>
@@ -3343,7 +3343,7 @@
                 <w:color w:val="767171" w:themeColor="background2" w:themeShade="80"/>
                 <w:sz w:val="18"/>
               </w:rPr>
-              <w:t>0</w:t>
+              <w:t>[Employee LWF - Annual]</w:t>
             </w:r>
           </w:p>
         </w:tc>
@@ -3560,7 +3560,7 @@
                 <w:color w:val="767171" w:themeColor="background2" w:themeShade="80"/>
                 <w:sz w:val="18"/>
               </w:rPr>
-              <w:t>_</w:t>
+              <w:t>[Company ESIC - Monthly]</w:t>
             </w:r>
           </w:p>
         </w:tc>
@@ -3584,7 +3584,7 @@
                 <w:color w:val="767171" w:themeColor="background2" w:themeShade="80"/>
                 <w:sz w:val="18"/>
               </w:rPr>
-              <w:t>_</w:t>
+              <w:t>[Company ESIC - Annual]</w:t>
             </w:r>
           </w:p>
         </w:tc>
@@ -3638,7 +3638,7 @@
                 <w:color w:val="767171" w:themeColor="background2" w:themeShade="80"/>
                 <w:sz w:val="18"/>
               </w:rPr>
-              <w:t>0</w:t>
+              <w:t>[Company LWF - Monthly]</w:t>
             </w:r>
           </w:p>
         </w:tc>
@@ -3662,7 +3662,7 @@
                 <w:color w:val="767171" w:themeColor="background2" w:themeShade="80"/>
                 <w:sz w:val="18"/>
               </w:rPr>
-              <w:t>0</w:t>
+              <w:t>[Company LWF - Annual]</w:t>
             </w:r>
           </w:p>
         </w:tc>

</xml_diff>